<commit_message>
Peisistratos: Schaubild (Teil B) parallel zum Tafel-Puzzle ausfüllen; Folien auf 12 gestrafft, Handreichung und PDFs aktualisiert
Co-Authored-By: Claude Opus 5.5 <noreply@anthropic.com>
Claude-Session: https://claude.ai/code/session_013iN4Tiarea1J9YUJHZ9iqC
</commit_message>
<xml_diff>
--- a/Geschichte_11/Stunde_Peisistratos/Arbeitsblatt_Peisistratos_A4.docx
+++ b/Geschichte_11/Stunde_Peisistratos/Arbeitsblatt_Peisistratos_A4.docx
@@ -475,7 +475,7 @@
                 <w:sz w:val="19"/>
                 <w:szCs w:val="19"/>
               </w:rPr>
-              <w:t xml:space="preserve">Sicherung – erst nach dem Tafel-Puzzle, wenn die Lehrkraft es sagt</w:t>
+              <w:t xml:space="preserve">Das ganze Bild – füllt ihr beim Tafel-Puzzle mit aus</w:t>
             </w:r>
           </w:p>
         </w:tc>
@@ -640,7 +640,7 @@
           <w:sz w:val="20"/>
           <w:szCs w:val="20"/>
         </w:rPr>
-        <w:t xml:space="preserve">Schreibe in jedes Feld mindestens eine Maßnahme als Stichwort. Beim Adel: links (✓), wer gewinnt – rechts (✗), wer verliert.</w:t>
+        <w:t xml:space="preserve">Bei jeder Karte an der Tafel: Schreibe die Maßnahme als Stichwort ins passende Feld. Beim Adel: links (✓), wer gewinnt – rechts (✗), wer verliert.</w:t>
       </w:r>
     </w:p>
     <w:p>

</xml_diff>